<commit_message>
Update MANUAL.docx with progressive loading and search features
Mark text search and progressive loading as complete in status and
roadmap sections. Update file structure descriptions to reflect new
module responsibilities. Update PDF characteristics section to document
the implemented progressive loading pipeline.

Co-Authored-By: Claude Opus 4.6 <noreply@anthropic.com>
</commit_message>
<xml_diff>
--- a/asi-viewer/MANUAL.docx
+++ b/asi-viewer/MANUAL.docx
@@ -1063,7 +1063,7 @@
         <w:pStyle w:val="ListBullet"/>
       </w:pPr>
       <w:r>
-        <w:t>☐ Text search within PDF</w:t>
+        <w:t>☑ Text search within PDF (with partial-search indicator during progressive loading)</w:t>
       </w:r>
     </w:p>
     <w:p>
@@ -1079,7 +1079,7 @@
         <w:pStyle w:val="ListBullet"/>
       </w:pPr>
       <w:r>
-        <w:t>☐ Performance optimisation for large PDFs (lazy rendering, page recycling)</w:t>
+        <w:t>☑ Progressive loading with concurrent render pool (3 workers) and lazy rendering via IntersectionObserver</w:t>
       </w:r>
     </w:p>
     <w:p>
@@ -1909,35 +1909,45 @@
         <w:br/>
         <w:t>├── js/</w:t>
         <w:br/>
-        <w:t>│   ├── viewer.js               # Main application controller</w:t>
+        <w:t>│   ├── viewer.js               # Main controller — progressive init(), renderPool(), background text extraction</w:t>
         <w:br/>
-        <w:t>│   ├── pdf-renderer.js         # PDF.js loading and page rendering</w:t>
+        <w:t>│   ├── pdf-renderer.js         # PDF.js loading, renderPage(), ensurePageRendered() with dedup map</w:t>
         <w:br/>
-        <w:t>│   ├── watermark.js            # Watermark engine</w:t>
+        <w:t>│   ├── watermark.js            # Watermark engine (applyWatermark, applyPrintWatermark)</w:t>
         <w:br/>
-        <w:t>│   ├── flipbook.js             # StPageFlip wrapper</w:t>
+        <w:t>│   ├── flipbook.js             # StPageFlip wrapper — sparse-tolerant, updateFlipbookPage(), data-page attrs</w:t>
         <w:br/>
-        <w:t>│   ├── thumbnails.js           # Thumbnail strip management</w:t>
+        <w:t>│   ├── thumbnails.js           # Lazy thumbnail strip — IntersectionObserver, placeholder divs</w:t>
         <w:br/>
-        <w:t>│   ├── navigation.js           # Page nav, keyboard shortcuts, zoom</w:t>
+        <w:t>│   ├── navigation.js           # Page nav, lazy scroll mode (IntersectionObserver), async print, zoom</w:t>
         <w:br/>
-        <w:t>│   ├── content-protection.js   # Right-click, print intercept</w:t>
+        <w:t>│   ├── search.js               # Find-in-document with partial-search indicator</w:t>
         <w:br/>
-        <w:t>│   ├── settings.js             # Admin settings panel</w:t>
+        <w:t>│   ├── settings.js             # Admin settings panel with live preview</w:t>
         <w:br/>
-        <w:t>│   └── config.js               # Configuration and credential handling</w:t>
+        <w:t>│   ├── content-protection.js   # Right-click, print intercept, copy prevention</w:t>
+        <w:br/>
+        <w:t>│   └── config.js               # Configuration and credential handling (6-source priority chain)</w:t>
         <w:br/>
         <w:t>├── lib/</w:t>
         <w:br/>
         <w:t>│   ├── pdf.min.js              # PDF.js library (v3.11.174)</w:t>
         <w:br/>
-        <w:t>│   ├── pdf.worker.min.js       # PDF.js web worker</w:t>
+        <w:t>│   ├── pdf.worker.min.js       # PDF.js web worker (serve locally!)</w:t>
         <w:br/>
         <w:t>│   ├── page-flip.browser.js    # StPageFlip library (v2.0.7)</w:t>
         <w:br/>
         <w:t>│   └── pdf-lib.min.js          # pdf-lib (v1.17.1) — PDF metadata writing</w:t>
         <w:br/>
+        <w:t>├── img/</w:t>
+        <w:br/>
+        <w:t>│   ├── asi-logo.png            # ASI logo for toolbar branding</w:t>
+        <w:br/>
+        <w:t>│   └── favicon.png             # Browser tab icon</w:t>
+        <w:br/>
         <w:t>└── tests/</w:t>
+        <w:br/>
+        <w:t xml:space="preserve">    ├── verify.js               # Automated verification script (node tests/verify.js [port])</w:t>
         <w:br/>
         <w:t xml:space="preserve">    └── test-pdfs/              # Sample PDFs for testing</w:t>
       </w:r>
@@ -2132,7 +2142,7 @@
         <w:pStyle w:val="ListBullet"/>
       </w:pPr>
       <w:r>
-        <w:t>☐ Text search within PDF</w:t>
+        <w:t>☑ Text search within PDF (find-in-document with result list, highlight, and navigation)</w:t>
       </w:r>
     </w:p>
     <w:p>
@@ -2148,7 +2158,7 @@
         <w:pStyle w:val="ListBullet"/>
       </w:pPr>
       <w:r>
-        <w:t>☐ Performance: Lazy page rendering</w:t>
+        <w:t>☑ Performance: Progressive loading — render page 1 fast, show UI, lazy-render rest with concurrent pool (3 workers)</w:t>
       </w:r>
     </w:p>
     <w:p>
@@ -3318,15 +3328,7 @@
         <w:pStyle w:val="ListBullet"/>
       </w:pPr>
       <w:r>
-        <w:t>Progressive loading not critical: Documents are small enough to load entirely upfront</w:t>
-      </w:r>
-    </w:p>
-    <w:p>
-      <w:pPr>
-        <w:pStyle w:val="ListBullet"/>
-      </w:pPr>
-      <w:r>
-        <w:t>Page pre-rendering is feasible: Can render all pages at init without performance issues</w:t>
+        <w:t>Progressive loading implemented: Viewer renders page 1 first, shows the UI immediately, then lazily renders remaining pages in the background with a concurrent pool (3 workers). IntersectionObserver lazily loads thumbnails and scroll-mode pages on demand.</w:t>
       </w:r>
     </w:p>
     <w:p>
@@ -3344,6 +3346,12 @@
       <w:r>
         <w:t>No conversion needed: PDF.js handles these files natively — this is the core advantage over FlowPaper</w:t>
       </w:r>
+    </w:p>
+    <w:p>
+      <w:pPr>
+        <w:pStyle w:val="ListBullet"/>
+      </w:pPr>
+      <w:r/>
     </w:p>
     <w:p>
       <w:pPr>

</xml_diff>